<commit_message>
Team 1 Post Service DFDs
</commit_message>
<xml_diff>
--- a/03_Team_Work/Team1/Milestone_3_Components/Part2/1_In_Progress/DC_M3_Team1_DFD_JobPostingService_v1.0.docx
+++ b/03_Team_Work/Team1/Milestone_3_Components/Part2/1_In_Progress/DC_M3_Team1_DFD_JobPostingService_v1.0.docx
@@ -78,25 +78,23 @@
           <w:b/>
           <w:bCs/>
         </w:rPr>
-        <w:t xml:space="preserve">&lt;title of </w:t>
-      </w:r>
-      <w:proofErr w:type="spellStart"/>
-      <w:r>
-        <w:rPr>
-          <w:rFonts w:ascii="Arial" w:hAnsi="Arial"/>
-          <w:b/>
-          <w:bCs/>
-        </w:rPr>
-        <w:t>dfd</w:t>
-      </w:r>
-      <w:proofErr w:type="spellEnd"/>
-      <w:r>
-        <w:rPr>
-          <w:rFonts w:ascii="Arial" w:hAnsi="Arial"/>
-          <w:b/>
-          <w:bCs/>
-        </w:rPr>
-        <w:t xml:space="preserve"> goes here&gt;</w:t>
+        <w:t>&lt;</w:t>
+      </w:r>
+      <w:r>
+        <w:rPr>
+          <w:rFonts w:ascii="Arial" w:hAnsi="Arial"/>
+          <w:b/>
+          <w:bCs/>
+        </w:rPr>
+        <w:t>Job Post Creation &amp; Management</w:t>
+      </w:r>
+      <w:r>
+        <w:rPr>
+          <w:rFonts w:ascii="Arial" w:hAnsi="Arial"/>
+          <w:b/>
+          <w:bCs/>
+        </w:rPr>
+        <w:t>&gt;</w:t>
       </w:r>
     </w:p>
     <w:p>
@@ -119,63 +117,58 @@
       <w:r>
         <w:rPr>
           <w:rFonts w:ascii="Arial" w:hAnsi="Arial"/>
+          <w:noProof/>
           <w:sz w:val="20"/>
           <w:szCs w:val="20"/>
         </w:rPr>
-        <w:t xml:space="preserve">&lt;Diagram Goes Here. Load the </w:t>
-      </w:r>
-      <w:proofErr w:type="spellStart"/>
-      <w:r>
-        <w:rPr>
-          <w:rFonts w:ascii="Arial" w:hAnsi="Arial"/>
-          <w:sz w:val="20"/>
-          <w:szCs w:val="20"/>
-        </w:rPr>
-        <w:t>dfd.drawio</w:t>
-      </w:r>
-      <w:proofErr w:type="spellEnd"/>
-      <w:r>
-        <w:rPr>
-          <w:rFonts w:ascii="Arial" w:hAnsi="Arial"/>
-          <w:sz w:val="20"/>
-          <w:szCs w:val="20"/>
-        </w:rPr>
-        <w:t xml:space="preserve"> file </w:t>
-      </w:r>
-      <w:r>
-        <w:rPr>
-          <w:rFonts w:ascii="Arial" w:hAnsi="Arial"/>
-          <w:sz w:val="20"/>
-          <w:szCs w:val="20"/>
-        </w:rPr>
-        <w:t xml:space="preserve">in the /Reference folder </w:t>
-      </w:r>
-      <w:r>
-        <w:rPr>
-          <w:rFonts w:ascii="Arial" w:hAnsi="Arial"/>
-          <w:sz w:val="20"/>
-          <w:szCs w:val="20"/>
-        </w:rPr>
-        <w:t xml:space="preserve">into </w:t>
-      </w:r>
-      <w:hyperlink r:id="rId4" w:history="1">
-        <w:r>
-          <w:rPr>
-            <w:rStyle w:val="Hyperlink"/>
-            <w:rFonts w:ascii="Arial" w:hAnsi="Arial"/>
-            <w:sz w:val="20"/>
-            <w:szCs w:val="20"/>
-          </w:rPr>
-          <w:t>https://app.diagrams.net/</w:t>
-        </w:r>
-      </w:hyperlink>
-      <w:r>
-        <w:rPr>
-          <w:rFonts w:ascii="Arial" w:hAnsi="Arial"/>
-          <w:sz w:val="20"/>
-          <w:szCs w:val="20"/>
-        </w:rPr>
-        <w:t xml:space="preserve"> to use as a template.&gt;</w:t>
+        <w:drawing>
+          <wp:inline distT="0" distB="0" distL="0" distR="0" wp14:anchorId="52B1DE53" wp14:editId="325E162B">
+            <wp:extent cx="6332855" cy="3361055"/>
+            <wp:effectExtent l="0" t="0" r="0" b="0"/>
+            <wp:docPr id="1015104063" name="Picture 1"/>
+            <wp:cNvGraphicFramePr>
+              <a:graphicFrameLocks xmlns:a="http://schemas.openxmlformats.org/drawingml/2006/main" noChangeAspect="1"/>
+            </wp:cNvGraphicFramePr>
+            <a:graphic xmlns:a="http://schemas.openxmlformats.org/drawingml/2006/main">
+              <a:graphicData uri="http://schemas.openxmlformats.org/drawingml/2006/picture">
+                <pic:pic xmlns:pic="http://schemas.openxmlformats.org/drawingml/2006/picture">
+                  <pic:nvPicPr>
+                    <pic:cNvPr id="0" name="Picture 1"/>
+                    <pic:cNvPicPr>
+                      <a:picLocks noChangeAspect="1" noChangeArrowheads="1"/>
+                    </pic:cNvPicPr>
+                  </pic:nvPicPr>
+                  <pic:blipFill>
+                    <a:blip r:embed="rId4">
+                      <a:extLst>
+                        <a:ext uri="{28A0092B-C50C-407E-A947-70E740481C1C}">
+                          <a14:useLocalDpi xmlns:a14="http://schemas.microsoft.com/office/drawing/2010/main" val="0"/>
+                        </a:ext>
+                      </a:extLst>
+                    </a:blip>
+                    <a:srcRect/>
+                    <a:stretch>
+                      <a:fillRect/>
+                    </a:stretch>
+                  </pic:blipFill>
+                  <pic:spPr bwMode="auto">
+                    <a:xfrm>
+                      <a:off x="0" y="0"/>
+                      <a:ext cx="6332855" cy="3361055"/>
+                    </a:xfrm>
+                    <a:prstGeom prst="rect">
+                      <a:avLst/>
+                    </a:prstGeom>
+                    <a:noFill/>
+                    <a:ln>
+                      <a:noFill/>
+                    </a:ln>
+                  </pic:spPr>
+                </pic:pic>
+              </a:graphicData>
+            </a:graphic>
+          </wp:inline>
+        </w:drawing>
       </w:r>
     </w:p>
     <w:p>
@@ -225,25 +218,23 @@
           <w:b/>
           <w:bCs/>
         </w:rPr>
-        <w:t xml:space="preserve">&lt;title of </w:t>
-      </w:r>
-      <w:proofErr w:type="spellStart"/>
-      <w:r>
-        <w:rPr>
-          <w:rFonts w:ascii="Arial" w:hAnsi="Arial"/>
-          <w:b/>
-          <w:bCs/>
-        </w:rPr>
-        <w:t>dfd</w:t>
-      </w:r>
-      <w:proofErr w:type="spellEnd"/>
-      <w:r>
-        <w:rPr>
-          <w:rFonts w:ascii="Arial" w:hAnsi="Arial"/>
-          <w:b/>
-          <w:bCs/>
-        </w:rPr>
-        <w:t xml:space="preserve"> goes here&gt;</w:t>
+        <w:t>&lt;</w:t>
+      </w:r>
+      <w:r>
+        <w:rPr>
+          <w:rFonts w:ascii="Arial" w:hAnsi="Arial"/>
+          <w:b/>
+          <w:bCs/>
+        </w:rPr>
+        <w:t>Post Validation &amp; Publishing</w:t>
+      </w:r>
+      <w:r>
+        <w:rPr>
+          <w:rFonts w:ascii="Arial" w:hAnsi="Arial"/>
+          <w:b/>
+          <w:bCs/>
+        </w:rPr>
+        <w:t>&gt;</w:t>
       </w:r>
     </w:p>
     <w:p>
@@ -266,63 +257,58 @@
       <w:r>
         <w:rPr>
           <w:rFonts w:ascii="Arial" w:hAnsi="Arial"/>
+          <w:noProof/>
           <w:sz w:val="20"/>
           <w:szCs w:val="20"/>
         </w:rPr>
-        <w:t xml:space="preserve">&lt;Diagram Goes Here. Load the </w:t>
-      </w:r>
-      <w:proofErr w:type="spellStart"/>
-      <w:r>
-        <w:rPr>
-          <w:rFonts w:ascii="Arial" w:hAnsi="Arial"/>
-          <w:sz w:val="20"/>
-          <w:szCs w:val="20"/>
-        </w:rPr>
-        <w:t>dfd.drawio</w:t>
-      </w:r>
-      <w:proofErr w:type="spellEnd"/>
-      <w:r>
-        <w:rPr>
-          <w:rFonts w:ascii="Arial" w:hAnsi="Arial"/>
-          <w:sz w:val="20"/>
-          <w:szCs w:val="20"/>
-        </w:rPr>
-        <w:t xml:space="preserve"> file</w:t>
-      </w:r>
-      <w:r>
-        <w:rPr>
-          <w:rFonts w:ascii="Arial" w:hAnsi="Arial"/>
-          <w:sz w:val="20"/>
-          <w:szCs w:val="20"/>
-        </w:rPr>
-        <w:t xml:space="preserve"> in the /Reference folder</w:t>
-      </w:r>
-      <w:r>
-        <w:rPr>
-          <w:rFonts w:ascii="Arial" w:hAnsi="Arial"/>
-          <w:sz w:val="20"/>
-          <w:szCs w:val="20"/>
-        </w:rPr>
-        <w:t xml:space="preserve"> into </w:t>
-      </w:r>
-      <w:hyperlink r:id="rId5" w:history="1">
-        <w:r>
-          <w:rPr>
-            <w:rStyle w:val="Hyperlink"/>
-            <w:rFonts w:ascii="Arial" w:hAnsi="Arial"/>
-            <w:sz w:val="20"/>
-            <w:szCs w:val="20"/>
-          </w:rPr>
-          <w:t>https://app.diagrams.net/</w:t>
-        </w:r>
-      </w:hyperlink>
-      <w:r>
-        <w:rPr>
-          <w:rFonts w:ascii="Arial" w:hAnsi="Arial"/>
-          <w:sz w:val="20"/>
-          <w:szCs w:val="20"/>
-        </w:rPr>
-        <w:t xml:space="preserve"> to use as a template.&gt;</w:t>
+        <w:drawing>
+          <wp:inline distT="0" distB="0" distL="0" distR="0" wp14:anchorId="7D569828" wp14:editId="69D244C9">
+            <wp:extent cx="5926455" cy="3640455"/>
+            <wp:effectExtent l="0" t="0" r="0" b="0"/>
+            <wp:docPr id="1987041703" name="Picture 2"/>
+            <wp:cNvGraphicFramePr>
+              <a:graphicFrameLocks xmlns:a="http://schemas.openxmlformats.org/drawingml/2006/main" noChangeAspect="1"/>
+            </wp:cNvGraphicFramePr>
+            <a:graphic xmlns:a="http://schemas.openxmlformats.org/drawingml/2006/main">
+              <a:graphicData uri="http://schemas.openxmlformats.org/drawingml/2006/picture">
+                <pic:pic xmlns:pic="http://schemas.openxmlformats.org/drawingml/2006/picture">
+                  <pic:nvPicPr>
+                    <pic:cNvPr id="0" name="Picture 2"/>
+                    <pic:cNvPicPr>
+                      <a:picLocks noChangeAspect="1" noChangeArrowheads="1"/>
+                    </pic:cNvPicPr>
+                  </pic:nvPicPr>
+                  <pic:blipFill>
+                    <a:blip r:embed="rId5">
+                      <a:extLst>
+                        <a:ext uri="{28A0092B-C50C-407E-A947-70E740481C1C}">
+                          <a14:useLocalDpi xmlns:a14="http://schemas.microsoft.com/office/drawing/2010/main" val="0"/>
+                        </a:ext>
+                      </a:extLst>
+                    </a:blip>
+                    <a:srcRect/>
+                    <a:stretch>
+                      <a:fillRect/>
+                    </a:stretch>
+                  </pic:blipFill>
+                  <pic:spPr bwMode="auto">
+                    <a:xfrm>
+                      <a:off x="0" y="0"/>
+                      <a:ext cx="5926455" cy="3640455"/>
+                    </a:xfrm>
+                    <a:prstGeom prst="rect">
+                      <a:avLst/>
+                    </a:prstGeom>
+                    <a:noFill/>
+                    <a:ln>
+                      <a:noFill/>
+                    </a:ln>
+                  </pic:spPr>
+                </pic:pic>
+              </a:graphicData>
+            </a:graphic>
+          </wp:inline>
+        </w:drawing>
       </w:r>
     </w:p>
     <w:sectPr>

</xml_diff>